<commit_message>
Distinguish S1 parties and date placeholders
</commit_message>
<xml_diff>
--- a/tools/candidates/s1-oplata-za-raboty/06-uvedomlenie-o-prosrochke.docx
+++ b/tools/candidates/s1-oplata-za-raboty/06-uvedomlenie-o-prosrochke.docx
@@ -714,7 +714,7 @@
           <w:b w:val="0"/>
           <w:i w:val="0"/>
         </w:rPr>
-        <w:t>Просим оплатить задолженность в срок до {{ДАТА}} по реквизитам: {{БАНКОВСКИЕ_РЕКВИЗИТЫ}}. Если у Заказчика есть возражения по сумме, просим сообщить их письменно в тот же срок.</w:t>
+        <w:t>Просим оплатить задолженность в срок до {{ДАТА_ОПЛАТЫ_ПО_ТРЕБОВАНИЮ}} по реквизитам: {{БАНКОВСКИЕ_РЕКВИЗИТЫ}}. Если у Заказчика есть возражения по сумме, просим сообщить их письменно в тот же срок.</w:t>
       </w:r>
     </w:p>
     <w:p>
@@ -732,7 +732,7 @@
           <w:b w:val="0"/>
           <w:i w:val="0"/>
         </w:rPr>
-        <w:t>Приложение: реестр взаиморасчётов на {{ДАТА}}.</w:t>
+        <w:t>Приложение: реестр взаиморасчётов на {{ДАТА_РЕЕСТРА_ВЗАИМОРАСЧЁТОВ}}.</w:t>
       </w:r>
     </w:p>
     <w:p>

</xml_diff>